<commit_message>
Updated cartridge version (#66)
</commit_message>
<xml_diff>
--- a/link/documentation/Signifyd LINK Integration Documentation 22.1.0 - BM Modern UI.docx
+++ b/link/documentation/Signifyd LINK Integration Documentation 22.1.0 - BM Modern UI.docx
@@ -56,19 +56,7 @@
         <w:rPr>
           <w:rFonts w:asciiTheme="majorHAnsi" w:hAnsiTheme="majorHAnsi"/>
         </w:rPr>
-        <w:t>5</w:t>
-      </w:r>
-      <w:r>
-        <w:rPr>
-          <w:rFonts w:asciiTheme="majorHAnsi" w:hAnsiTheme="majorHAnsi"/>
-        </w:rPr>
-        <w:t>.</w:t>
-      </w:r>
-      <w:r>
-        <w:rPr>
-          <w:rFonts w:asciiTheme="majorHAnsi" w:hAnsiTheme="majorHAnsi"/>
-        </w:rPr>
-        <w:t>0</w:t>
+        <w:t>6.1</w:t>
       </w:r>
     </w:p>
     <w:p>
@@ -5060,8 +5048,8 @@
       <w:pPr>
         <w:pStyle w:val="Ttulo3"/>
       </w:pPr>
-      <w:bookmarkStart w:id="16" w:name="_Hlk83804264"/>
-      <w:bookmarkStart w:id="17" w:name="_Toc234947649"/>
+      <w:bookmarkStart w:id="16" w:name="_Toc234947649"/>
+      <w:bookmarkStart w:id="17" w:name="_Hlk83804264"/>
       <w:r>
         <w:t>4.1.</w:t>
       </w:r>
@@ -5077,7 +5065,7 @@
       <w:r>
         <w:t>authorization</w:t>
       </w:r>
-      <w:bookmarkEnd w:id="17"/>
+      <w:bookmarkEnd w:id="16"/>
     </w:p>
     <w:p/>
     <w:p>
@@ -5114,7 +5102,7 @@
       <w:r>
         <w:t xml:space="preserve">Signifyd decisions are returned synchronously </w:t>
       </w:r>
-      <w:bookmarkEnd w:id="16"/>
+      <w:bookmarkEnd w:id="17"/>
       <w:r>
         <w:t xml:space="preserve">after the </w:t>
       </w:r>
@@ -14997,8 +14985,8 @@
         <w:pStyle w:val="Ttulo1"/>
       </w:pPr>
       <w:bookmarkStart w:id="68" w:name="_Toc104994184"/>
-      <w:bookmarkStart w:id="69" w:name="_Toc245264376"/>
-      <w:bookmarkStart w:id="70" w:name="_Toc234947692"/>
+      <w:bookmarkStart w:id="69" w:name="_Toc234947692"/>
+      <w:bookmarkStart w:id="70" w:name="_Toc245264376"/>
       <w:r>
         <w:t xml:space="preserve">6 </w:t>
       </w:r>
@@ -15006,7 +14994,7 @@
         <w:t>Operations, Maintenance</w:t>
       </w:r>
       <w:bookmarkEnd w:id="68"/>
-      <w:bookmarkEnd w:id="70"/>
+      <w:bookmarkEnd w:id="69"/>
     </w:p>
     <w:p>
       <w:pPr>
@@ -15140,7 +15128,7 @@
         </w:rPr>
         <w:t xml:space="preserve">. </w:t>
       </w:r>
-      <w:bookmarkEnd w:id="69"/>
+      <w:bookmarkEnd w:id="70"/>
     </w:p>
     <w:p>
       <w:pPr>
@@ -15304,13 +15292,13 @@
         </w:pBdr>
       </w:pPr>
       <w:bookmarkStart w:id="77" w:name="_Toc104994188"/>
-      <w:bookmarkStart w:id="78" w:name="_Hlk75794236"/>
-      <w:bookmarkStart w:id="79" w:name="_Toc234947696"/>
+      <w:bookmarkStart w:id="78" w:name="_Toc234947696"/>
+      <w:bookmarkStart w:id="79" w:name="_Hlk75794236"/>
       <w:r>
         <w:t>7 Release History</w:t>
       </w:r>
       <w:bookmarkEnd w:id="77"/>
-      <w:bookmarkEnd w:id="79"/>
+      <w:bookmarkEnd w:id="78"/>
     </w:p>
     <w:p>
       <w:pPr>
@@ -15328,7 +15316,7 @@
       </w:pPr>
       <w:bookmarkStart w:id="80" w:name="_Toc279703501"/>
       <w:bookmarkStart w:id="81" w:name="_Toc279703594"/>
-      <w:bookmarkEnd w:id="78"/>
+      <w:bookmarkEnd w:id="79"/>
     </w:p>
     <w:tbl>
       <w:tblPr>
@@ -23748,45 +23736,6 @@
 </file>
 
 <file path=customXml/item1.xml><?xml version="1.0" encoding="utf-8"?>
-<b:Sources xmlns:b="http://schemas.openxmlformats.org/officeDocument/2006/bibliography" xmlns="http://schemas.openxmlformats.org/officeDocument/2006/bibliography" SelectedStyle="\CHICAGO.XSL" StyleName="Chicago"/>
-</file>
-
-<file path=customXml/item2.xml><?xml version="1.0" encoding="utf-8"?>
-<?mso-contentType ?>
-<FormTemplates xmlns="http://schemas.microsoft.com/sharepoint/v3/contenttype/forms">
-  <Display>DocumentLibraryForm</Display>
-  <Edit>DocumentLibraryForm</Edit>
-  <New>DocumentLibraryForm</New>
-</FormTemplates>
-</file>
-
-<file path=customXml/item3.xml><?xml version="1.0" encoding="utf-8"?>
-<b:Sources xmlns:b="http://schemas.openxmlformats.org/officeDocument/2006/bibliography" xmlns="http://schemas.openxmlformats.org/officeDocument/2006/bibliography" SelectedStyle="\CHICAGO.XSL" StyleName="Chicago"/>
-</file>
-
-<file path=customXml/item4.xml><?xml version="1.0" encoding="utf-8"?>
-<b:Sources xmlns:b="http://schemas.openxmlformats.org/officeDocument/2006/bibliography" xmlns="http://schemas.openxmlformats.org/officeDocument/2006/bibliography" SelectedStyle="\CHICAGO.XSL" StyleName="Chicago"/>
-</file>
-
-<file path=customXml/item5.xml><?xml version="1.0" encoding="utf-8"?>
-<b:Sources xmlns:b="http://schemas.openxmlformats.org/officeDocument/2006/bibliography" xmlns="http://schemas.openxmlformats.org/officeDocument/2006/bibliography" SelectedStyle="\CHICAGO.XSL" StyleName="Chicago"/>
-</file>
-
-<file path=customXml/item6.xml><?xml version="1.0" encoding="utf-8"?>
-<p:properties xmlns:p="http://schemas.microsoft.com/office/2006/metadata/properties" xmlns:xsi="http://www.w3.org/2001/XMLSchema-instance" xmlns:pc="http://schemas.microsoft.com/office/infopath/2007/PartnerControls">
-  <documentManagement>
-    <k0a767481f69401b9656bbf4dd6abb1d xmlns="2680ebc2-70e2-42cc-af17-343d078fef82">
-      <Terms xmlns="http://schemas.microsoft.com/office/infopath/2007/PartnerControls"/>
-    </k0a767481f69401b9656bbf4dd6abb1d>
-    <TaxCatchAll xmlns="41dbd0cf-c47a-4cea-8dfa-c6db00955148"/>
-    <l11c893632bd4f5284d827a786471c77 xmlns="2680ebc2-70e2-42cc-af17-343d078fef82">
-      <Terms xmlns="http://schemas.microsoft.com/office/infopath/2007/PartnerControls"/>
-    </l11c893632bd4f5284d827a786471c77>
-  </documentManagement>
-</p:properties>
-</file>
-
-<file path=customXml/item7.xml><?xml version="1.0" encoding="utf-8"?>
 <ct:contentTypeSchema xmlns:ct="http://schemas.microsoft.com/office/2006/metadata/contentType" xmlns:ma="http://schemas.microsoft.com/office/2006/metadata/properties/metaAttributes" ct:_="" ma:_="" ma:contentTypeName="Document" ma:contentTypeID="0x010100BAC6AAE9A7AC6F448B8E6AD308F25C33" ma:contentTypeVersion="9" ma:contentTypeDescription="Create a new document." ma:contentTypeScope="" ma:versionID="9947e9a47e1bfbe6ee25356abc8c556f">
   <xsd:schema xmlns:xsd="http://www.w3.org/2001/XMLSchema" xmlns:xs="http://www.w3.org/2001/XMLSchema" xmlns:p="http://schemas.microsoft.com/office/2006/metadata/properties" xmlns:ns2="41dbd0cf-c47a-4cea-8dfa-c6db00955148" xmlns:ns3="2680ebc2-70e2-42cc-af17-343d078fef82" xmlns:ns4="3ab059b2-6124-4199-bb85-3249ccb31308" targetNamespace="http://schemas.microsoft.com/office/2006/metadata/properties" ma:root="true" ma:fieldsID="784c332b4ff724ef588fa3376e0daf40" ns2:_="" ns3:_="" ns4:_="">
     <xsd:import namespace="41dbd0cf-c47a-4cea-8dfa-c6db00955148"/>
@@ -23984,10 +23933,61 @@
 </ct:contentTypeSchema>
 </file>
 
+<file path=customXml/item2.xml><?xml version="1.0" encoding="utf-8"?>
+<?mso-contentType ?>
+<FormTemplates xmlns="http://schemas.microsoft.com/sharepoint/v3/contenttype/forms">
+  <Display>DocumentLibraryForm</Display>
+  <Edit>DocumentLibraryForm</Edit>
+  <New>DocumentLibraryForm</New>
+</FormTemplates>
+</file>
+
+<file path=customXml/item3.xml><?xml version="1.0" encoding="utf-8"?>
+<b:Sources xmlns:b="http://schemas.openxmlformats.org/officeDocument/2006/bibliography" xmlns="http://schemas.openxmlformats.org/officeDocument/2006/bibliography" SelectedStyle="\CHICAGO.XSL" StyleName="Chicago"/>
+</file>
+
+<file path=customXml/item4.xml><?xml version="1.0" encoding="utf-8"?>
+<b:Sources xmlns:b="http://schemas.openxmlformats.org/officeDocument/2006/bibliography" xmlns="http://schemas.openxmlformats.org/officeDocument/2006/bibliography" SelectedStyle="\CHICAGO.XSL" StyleName="Chicago"/>
+</file>
+
+<file path=customXml/item5.xml><?xml version="1.0" encoding="utf-8"?>
+<b:Sources xmlns:b="http://schemas.openxmlformats.org/officeDocument/2006/bibliography" xmlns="http://schemas.openxmlformats.org/officeDocument/2006/bibliography" SelectedStyle="\CHICAGO.XSL" StyleName="Chicago"/>
+</file>
+
+<file path=customXml/item6.xml><?xml version="1.0" encoding="utf-8"?>
+<p:properties xmlns:p="http://schemas.microsoft.com/office/2006/metadata/properties" xmlns:xsi="http://www.w3.org/2001/XMLSchema-instance" xmlns:pc="http://schemas.microsoft.com/office/infopath/2007/PartnerControls">
+  <documentManagement>
+    <k0a767481f69401b9656bbf4dd6abb1d xmlns="2680ebc2-70e2-42cc-af17-343d078fef82">
+      <Terms xmlns="http://schemas.microsoft.com/office/infopath/2007/PartnerControls"/>
+    </k0a767481f69401b9656bbf4dd6abb1d>
+    <TaxCatchAll xmlns="41dbd0cf-c47a-4cea-8dfa-c6db00955148"/>
+    <l11c893632bd4f5284d827a786471c77 xmlns="2680ebc2-70e2-42cc-af17-343d078fef82">
+      <Terms xmlns="http://schemas.microsoft.com/office/infopath/2007/PartnerControls"/>
+    </l11c893632bd4f5284d827a786471c77>
+  </documentManagement>
+</p:properties>
+</file>
+
+<file path=customXml/item7.xml><?xml version="1.0" encoding="utf-8"?>
+<b:Sources xmlns:b="http://schemas.openxmlformats.org/officeDocument/2006/bibliography" xmlns="http://schemas.openxmlformats.org/officeDocument/2006/bibliography" SelectedStyle="\CHICAGO.XSL" StyleName="Chicago"/>
+</file>
+
 <file path=customXml/itemProps1.xml><?xml version="1.0" encoding="utf-8"?>
-<ds:datastoreItem xmlns:ds="http://schemas.openxmlformats.org/officeDocument/2006/customXml" ds:itemID="{74EDC720-C843-4BCC-ACEC-72DB380D8DF2}">
+<ds:datastoreItem xmlns:ds="http://schemas.openxmlformats.org/officeDocument/2006/customXml" ds:itemID="{AB403CD4-F922-4E1D-B3EA-72C1A6D547E2}">
   <ds:schemaRefs>
-    <ds:schemaRef ds:uri="http://schemas.openxmlformats.org/officeDocument/2006/bibliography"/>
+    <ds:schemaRef ds:uri="http://schemas.microsoft.com/office/2006/metadata/contentType"/>
+    <ds:schemaRef ds:uri="http://schemas.microsoft.com/office/2006/metadata/properties/metaAttributes"/>
+    <ds:schemaRef ds:uri="http://www.w3.org/2001/XMLSchema"/>
+    <ds:schemaRef ds:uri="http://schemas.microsoft.com/office/2006/metadata/properties"/>
+    <ds:schemaRef ds:uri="41dbd0cf-c47a-4cea-8dfa-c6db00955148"/>
+    <ds:schemaRef ds:uri="2680ebc2-70e2-42cc-af17-343d078fef82"/>
+    <ds:schemaRef ds:uri="3ab059b2-6124-4199-bb85-3249ccb31308"/>
+    <ds:schemaRef ds:uri="http://schemas.microsoft.com/office/2006/documentManagement/types"/>
+    <ds:schemaRef ds:uri="http://schemas.microsoft.com/office/infopath/2007/PartnerControls"/>
+    <ds:schemaRef ds:uri="http://schemas.openxmlformats.org/package/2006/metadata/core-properties"/>
+    <ds:schemaRef ds:uri="http://purl.org/dc/elements/1.1/"/>
+    <ds:schemaRef ds:uri="http://purl.org/dc/terms/"/>
+    <ds:schemaRef ds:uri="http://schemas.microsoft.com/internal/obd"/>
   </ds:schemaRefs>
 </ds:datastoreItem>
 </file>
@@ -24001,6 +24001,14 @@
 </file>
 
 <file path=customXml/itemProps3.xml><?xml version="1.0" encoding="utf-8"?>
+<ds:datastoreItem xmlns:ds="http://schemas.openxmlformats.org/officeDocument/2006/customXml" ds:itemID="{05CD6A24-F136-463B-BF16-F15886741A5F}">
+  <ds:schemaRefs>
+    <ds:schemaRef ds:uri="http://schemas.openxmlformats.org/officeDocument/2006/bibliography"/>
+  </ds:schemaRefs>
+</ds:datastoreItem>
+</file>
+
+<file path=customXml/itemProps4.xml><?xml version="1.0" encoding="utf-8"?>
 <ds:datastoreItem xmlns:ds="http://schemas.openxmlformats.org/officeDocument/2006/customXml" ds:itemID="{DFFD90AB-A9CA-48E9-A772-13C69588A728}">
   <ds:schemaRefs>
     <ds:schemaRef ds:uri="http://schemas.openxmlformats.org/officeDocument/2006/bibliography"/>
@@ -24008,16 +24016,8 @@
 </ds:datastoreItem>
 </file>
 
-<file path=customXml/itemProps4.xml><?xml version="1.0" encoding="utf-8"?>
-<ds:datastoreItem xmlns:ds="http://schemas.openxmlformats.org/officeDocument/2006/customXml" ds:itemID="{0ACC11CF-7E2F-4A39-A1CC-435974F0A74C}">
-  <ds:schemaRefs>
-    <ds:schemaRef ds:uri="http://schemas.openxmlformats.org/officeDocument/2006/bibliography"/>
-  </ds:schemaRefs>
-</ds:datastoreItem>
-</file>
-
 <file path=customXml/itemProps5.xml><?xml version="1.0" encoding="utf-8"?>
-<ds:datastoreItem xmlns:ds="http://schemas.openxmlformats.org/officeDocument/2006/customXml" ds:itemID="{05CD6A24-F136-463B-BF16-F15886741A5F}">
+<ds:datastoreItem xmlns:ds="http://schemas.openxmlformats.org/officeDocument/2006/customXml" ds:itemID="{74EDC720-C843-4BCC-ACEC-72DB380D8DF2}">
   <ds:schemaRefs>
     <ds:schemaRef ds:uri="http://schemas.openxmlformats.org/officeDocument/2006/bibliography"/>
   </ds:schemaRefs>
@@ -24036,21 +24036,9 @@
 </file>
 
 <file path=customXml/itemProps7.xml><?xml version="1.0" encoding="utf-8"?>
-<ds:datastoreItem xmlns:ds="http://schemas.openxmlformats.org/officeDocument/2006/customXml" ds:itemID="{AB403CD4-F922-4E1D-B3EA-72C1A6D547E2}">
+<ds:datastoreItem xmlns:ds="http://schemas.openxmlformats.org/officeDocument/2006/customXml" ds:itemID="{0ACC11CF-7E2F-4A39-A1CC-435974F0A74C}">
   <ds:schemaRefs>
-    <ds:schemaRef ds:uri="http://schemas.microsoft.com/office/2006/metadata/contentType"/>
-    <ds:schemaRef ds:uri="http://schemas.microsoft.com/office/2006/metadata/properties/metaAttributes"/>
-    <ds:schemaRef ds:uri="http://www.w3.org/2001/XMLSchema"/>
-    <ds:schemaRef ds:uri="http://schemas.microsoft.com/office/2006/metadata/properties"/>
-    <ds:schemaRef ds:uri="41dbd0cf-c47a-4cea-8dfa-c6db00955148"/>
-    <ds:schemaRef ds:uri="2680ebc2-70e2-42cc-af17-343d078fef82"/>
-    <ds:schemaRef ds:uri="3ab059b2-6124-4199-bb85-3249ccb31308"/>
-    <ds:schemaRef ds:uri="http://schemas.microsoft.com/office/2006/documentManagement/types"/>
-    <ds:schemaRef ds:uri="http://schemas.microsoft.com/office/infopath/2007/PartnerControls"/>
-    <ds:schemaRef ds:uri="http://schemas.openxmlformats.org/package/2006/metadata/core-properties"/>
-    <ds:schemaRef ds:uri="http://purl.org/dc/elements/1.1/"/>
-    <ds:schemaRef ds:uri="http://purl.org/dc/terms/"/>
-    <ds:schemaRef ds:uri="http://schemas.microsoft.com/internal/obd"/>
+    <ds:schemaRef ds:uri="http://schemas.openxmlformats.org/officeDocument/2006/bibliography"/>
   </ds:schemaRefs>
 </ds:datastoreItem>
 </file>
</xml_diff>